<commit_message>
Actualización integral del pipeline: suicidios 2022-2024, reparación colectiva UARIV, ingresos de inversión, resumen-viñeta y correcciones de Pablo
Incorpora las 20 correcciones reportadas por Pablo (pandoc/RSTUDIO_PANDOC entre otras),
suma nuevas fuentes (DANE Cuadro 15 + SIVIGILA por residencia para suicidios/intentos
2022-2024, sujetos de reparación colectiva UARIV, ingresos de inversión por fuente vía
API de Mapa de Inversiones DNP) y agrega un resumen-viñeta por dimensión en los informes.
Corre limpio para las 11 provincias más el comparativo.

Co-Authored-By: Claude Sonnet 5 <noreply@anthropic.com>
</commit_message>
<xml_diff>
--- a/04_Docs/comparativo/Comparativo_provincias.docx
+++ b/04_Docs/comparativo/Comparativo_provincias.docx
@@ -31,7 +31,7 @@
         <w:pStyle w:val="Date"/>
       </w:pPr>
       <w:r>
-        <w:t xml:space="preserve">10 de agosto de 2026</w:t>
+        <w:t xml:space="preserve">21 de agosto de 2026</w:t>
       </w:r>
     </w:p>
     <w:sdt>
@@ -138,13 +138,13 @@
         <w:pStyle w:val="FirstParagraph"/>
       </w:pPr>
       <w:r>
-        <w:t xml:space="preserve">Las once Provincias Administrativas y de Planificación agrupan 88 de los 125 municipios de Antioquia. Ese 70,4 % de los municipios reúne el 78,9 % de la población departamental y el 54,5 % de su territorio. La diferencia entre las tres cifras ya dice algo sobre el diseño del esquema: cubre más población que territorio, porque los municipios que quedan fuera son en promedio más extensos y menos poblados.</w:t>
+        <w:t xml:space="preserve">Las once Provincias Administrativas y de Planificación agrupan 90 de los 125 municipios de Antioquia. Ese 72,0 % de los municipios reúne el 79,7 % de la población departamental y el 57,2 % de su territorio. La diferencia entre las tres cifras ya dice algo sobre el diseño del esquema: cubre más población que territorio, porque los municipios que quedan fuera son en promedio más extensos y menos poblados.</w:t>
       </w:r>
       <w:r>
         <w:t xml:space="preserve"> </w:t>
       </w:r>
       <w:r>
-        <w:t xml:space="preserve">Los 37 municipios que no pertenecen a ninguna provincia ocupan 28.596 km² y albergan 1.463.691 habitantes. No son un residuo: son casi la mitad del territorio del departamento. Cualquier lectura de los Planes Estratégicos Provinciales como instrumento de ordenamiento departamental tiene que decir qué ocurre con ese resto.</w:t>
+        <w:t xml:space="preserve">Los 35 municipios que no pertenecen a ninguna provincia ocupan 26.861 km² y albergan 1.406.216 habitantes. No son un residuo: son casi la mitad del territorio del departamento. Cualquier lectura de los Planes Estratégicos Provinciales como instrumento de ordenamiento departamental tiene que decir qué ocurre con ese resto.</w:t>
       </w:r>
     </w:p>
     <w:p>
@@ -161,7 +161,7 @@
               <a:graphicData uri="http://schemas.openxmlformats.org/drawingml/2006/picture">
                 <pic:pic>
                   <pic:nvPicPr>
-                    <pic:cNvPr descr="/Users/jcmunoz/github_repositories/Proyecto-Provincias/03_Outputs/_Comparativo/figuras/fig_c01_cobertura_sistema.png" id="11" name="Picture"/>
+                    <pic:cNvPr descr="03_Outputs/_Comparativo/figuras/fig_c01_cobertura_sistema.png" id="11" name="Picture"/>
                     <pic:cNvPicPr>
                       <a:picLocks noChangeArrowheads="1" noChangeAspect="1"/>
                     </pic:cNvPicPr>
@@ -216,7 +216,7 @@
               <a:graphicData uri="http://schemas.openxmlformats.org/drawingml/2006/picture">
                 <pic:pic>
                   <pic:nvPicPr>
-                    <pic:cNvPr descr="/Users/jcmunoz/github_repositories/Proyecto-Provincias/03_Outputs/_Comparativo/figuras/fig_c02_mapa_densidad.png" id="14" name="Picture"/>
+                    <pic:cNvPr descr="03_Outputs/_Comparativo/figuras/fig_c02_mapa_densidad.png" id="14" name="Picture"/>
                     <pic:cNvPicPr>
                       <a:picLocks noChangeArrowheads="1" noChangeAspect="1"/>
                     </pic:cNvPicPr>
@@ -272,13 +272,13 @@
         <w:pStyle w:val="FirstParagraph"/>
       </w:pPr>
       <w:r>
-        <w:t xml:space="preserve">El sistema es profundamente asimétrico. Área Metropolitana concentra por sí sola 4.194.012 habitantes, mientras que Turística y Agroecológica (66.792) y Agroindustrial del Occidente (81.100) no llegan a esa escala. La razón entre la provincia más poblada y la menos poblada es de 63 a 1; en extensión, la razón es de 6,5 a 1, con Bioenergética del Norte de Antioquia (7.550 km²) y Minero Agroecológica (5.095 km²) a la cabeza.</w:t>
+        <w:t xml:space="preserve">El sistema es profundamente asimétrico. Área Metropolitana concentra por sí sola 4.194.012 habitantes, mientras que Agroindustrial del Occidente (81.100) y Turística y Agroecológica (95.213) no llegan a esa escala. La razón entre la provincia más poblada y la menos poblada es de 52 a 1; en extensión, la razón es de 6,5 a 1, con Bioenergética del Norte de Antioquia (7.550 km²) y Minero Agroecológica (6.304 km²) a la cabeza.</w:t>
       </w:r>
       <w:r>
         <w:t xml:space="preserve"> </w:t>
       </w:r>
       <w:r>
-        <w:t xml:space="preserve">Esa asimetría no es un defecto de diseño sino el reflejo de que el Área Metropolitana entra al esquema con la lógica de una conurbación y las otras diez con la de un territorio rural. De hecho, 6 de las once provincias tienen más de la mitad de su población en centros poblados y rural disperso; las más rurales son Turística y Agroecológica (66,0 %) y Agroindustrial del Occidente (61,3 %). Comparar la primera con las otras diez en cualquier indicador per cápita exige tener presente esta diferencia de naturaleza.</w:t>
+        <w:t xml:space="preserve">Esa asimetría no es un defecto de diseño sino el reflejo de que el Área Metropolitana entra al esquema con la lógica de una conurbación y las otras diez con la de un territorio rural. De hecho, 6 de las once provincias tienen más de la mitad de su población en centros poblados y rural disperso; las más rurales son Agroindustrial del Occidente (61,3 %) y Penderisco y Sinifana (57,8 %). Comparar la primera con las otras diez en cualquier indicador per cápita exige tener presente esta diferencia de naturaleza.</w:t>
       </w:r>
     </w:p>
     <w:p>
@@ -295,7 +295,7 @@
               <a:graphicData uri="http://schemas.openxmlformats.org/drawingml/2006/picture">
                 <pic:pic>
                   <pic:nvPicPr>
-                    <pic:cNvPr descr="/Users/jcmunoz/github_repositories/Proyecto-Provincias/03_Outputs/_Comparativo/figuras/fig_c04_poblacion.png" id="18" name="Picture"/>
+                    <pic:cNvPr descr="03_Outputs/_Comparativo/figuras/fig_c04_poblacion.png" id="18" name="Picture"/>
                     <pic:cNvPicPr>
                       <a:picLocks noChangeArrowheads="1" noChangeAspect="1"/>
                     </pic:cNvPicPr>
@@ -350,7 +350,7 @@
               <a:graphicData uri="http://schemas.openxmlformats.org/drawingml/2006/picture">
                 <pic:pic>
                   <pic:nvPicPr>
-                    <pic:cNvPr descr="/Users/jcmunoz/github_repositories/Proyecto-Provincias/03_Outputs/_Comparativo/figuras/fig_c05_ruralidad.png" id="21" name="Picture"/>
+                    <pic:cNvPr descr="03_Outputs/_Comparativo/figuras/fig_c05_ruralidad.png" id="21" name="Picture"/>
                     <pic:cNvPicPr>
                       <a:picLocks noChangeArrowheads="1" noChangeAspect="1"/>
                     </pic:cNvPicPr>
@@ -718,7 +718,7 @@
               <w:pStyle w:val="Compact"/>
             </w:pPr>
             <w:r>
-              <w:t xml:space="preserve">7</w:t>
+              <w:t xml:space="preserve">8</w:t>
             </w:r>
           </w:p>
         </w:tc>
@@ -729,7 +729,7 @@
               <w:pStyle w:val="Compact"/>
             </w:pPr>
             <w:r>
-              <w:t xml:space="preserve">66.792</w:t>
+              <w:t xml:space="preserve">95.213</w:t>
             </w:r>
           </w:p>
         </w:tc>
@@ -740,7 +740,7 @@
               <w:pStyle w:val="Compact"/>
             </w:pPr>
             <w:r>
-              <w:t xml:space="preserve">1.315,3</w:t>
+              <w:t xml:space="preserve">1.841,0</w:t>
             </w:r>
           </w:p>
         </w:tc>
@@ -751,7 +751,7 @@
               <w:pStyle w:val="Compact"/>
             </w:pPr>
             <w:r>
-              <w:t xml:space="preserve">50,8</w:t>
+              <w:t xml:space="preserve">51,7</w:t>
             </w:r>
           </w:p>
         </w:tc>
@@ -762,7 +762,7 @@
               <w:pStyle w:val="Compact"/>
             </w:pPr>
             <w:r>
-              <w:t xml:space="preserve">66,0 %</w:t>
+              <w:t xml:space="preserve">56,8 %</w:t>
             </w:r>
           </w:p>
         </w:tc>
@@ -1058,7 +1058,7 @@
               <w:pStyle w:val="Compact"/>
             </w:pPr>
             <w:r>
-              <w:t xml:space="preserve">5</w:t>
+              <w:t xml:space="preserve">6</w:t>
             </w:r>
           </w:p>
         </w:tc>
@@ -1069,7 +1069,7 @@
               <w:pStyle w:val="Compact"/>
             </w:pPr>
             <w:r>
-              <w:t xml:space="preserve">117.281</w:t>
+              <w:t xml:space="preserve">146.335</w:t>
             </w:r>
           </w:p>
         </w:tc>
@@ -1080,7 +1080,7 @@
               <w:pStyle w:val="Compact"/>
             </w:pPr>
             <w:r>
-              <w:t xml:space="preserve">5.094,8</w:t>
+              <w:t xml:space="preserve">6.304,0</w:t>
             </w:r>
           </w:p>
         </w:tc>
@@ -1091,7 +1091,7 @@
               <w:pStyle w:val="Compact"/>
             </w:pPr>
             <w:r>
-              <w:t xml:space="preserve">23,0</w:t>
+              <w:t xml:space="preserve">23,2</w:t>
             </w:r>
           </w:p>
         </w:tc>
@@ -1102,7 +1102,7 @@
               <w:pStyle w:val="Compact"/>
             </w:pPr>
             <w:r>
-              <w:t xml:space="preserve">43,0 %</w:t>
+              <w:t xml:space="preserve">42,9 %</w:t>
             </w:r>
           </w:p>
         </w:tc>
@@ -1271,13 +1271,13 @@
         <w:pStyle w:val="FirstParagraph"/>
       </w:pPr>
       <w:r>
-        <w:t xml:space="preserve">La pobreza por Necesidades Básicas Insatisfechas separa al sistema en dos bloques. En el extremo alto están Minero Agroecológica (24,7 %), Bioenergética del Norte de Antioquia (19,8 %) y Agroindustrial del Occidente (19,6 %); en el bajo, Área Metropolitana (7,1 %) y Del Río Grande (7,2 %). De las once provincias, 8 superan la incidencia departamental de 11,4 %.</w:t>
+        <w:t xml:space="preserve">La pobreza por Necesidades Básicas Insatisfechas separa al sistema en dos bloques. En el extremo alto están Minero Agroecológica (24,7 %), Bioenergética del Norte de Antioquia (19,8 %) y Agroindustrial del Occidente (19,6 %); en el bajo, Área Metropolitana (7,1 %) y Del Río Grande (7,2 %). De las once provincias, 7 superan la incidencia departamental de 11,4 %.</w:t>
       </w:r>
       <w:r>
         <w:t xml:space="preserve"> </w:t>
       </w:r>
       <w:r>
-        <w:t xml:space="preserve">El Índice de Ciudades Modernas ordena a las provincias de forma parecida pero no idéntica: encabezan Área Metropolitana (67,1) y Del Río Grande (51,3) y cierran Minero Agroecológica (37,0) y Bioenergética del Norte de Antioquia (39,9), frente a un valor departamental de 59,2. Que los dos ordenamientos no coincidan del todo es informativo: el ICM incorpora dimensiones de gestión pública, seguridad y sostenibilidad que el NBI no mide, de modo que una provincia puede tener carencias materiales y aun así una institucionalidad relativamente sólida, o al revés.</w:t>
+        <w:t xml:space="preserve">El Índice de Ciudades Modernas ordena a las provincias de forma parecida pero no idéntica: encabezan Área Metropolitana (67,1) y Del Río Grande (51,3) y cierran Minero Agroecológica (37,8) y Bioenergética del Norte de Antioquia (39,9), frente a un valor departamental de 59,2. Que los dos ordenamientos no coincidan del todo es informativo: el ICM incorpora dimensiones de gestión pública, seguridad y sostenibilidad que el NBI no mide, de modo que una provincia puede tener carencias materiales y aun así una institucionalidad relativamente sólida, o al revés.</w:t>
       </w:r>
     </w:p>
     <w:p>
@@ -1294,7 +1294,7 @@
               <a:graphicData uri="http://schemas.openxmlformats.org/drawingml/2006/picture">
                 <pic:pic>
                   <pic:nvPicPr>
-                    <pic:cNvPr descr="/Users/jcmunoz/github_repositories/Proyecto-Provincias/03_Outputs/_Comparativo/figuras/fig_c06_nbi.png" id="25" name="Picture"/>
+                    <pic:cNvPr descr="03_Outputs/_Comparativo/figuras/fig_c06_nbi.png" id="25" name="Picture"/>
                     <pic:cNvPicPr>
                       <a:picLocks noChangeArrowheads="1" noChangeAspect="1"/>
                     </pic:cNvPicPr>
@@ -1349,7 +1349,7 @@
               <a:graphicData uri="http://schemas.openxmlformats.org/drawingml/2006/picture">
                 <pic:pic>
                   <pic:nvPicPr>
-                    <pic:cNvPr descr="/Users/jcmunoz/github_repositories/Proyecto-Provincias/03_Outputs/_Comparativo/figuras/fig_c03_mapa_nbi.png" id="28" name="Picture"/>
+                    <pic:cNvPr descr="03_Outputs/_Comparativo/figuras/fig_c03_mapa_nbi.png" id="28" name="Picture"/>
                     <pic:cNvPicPr>
                       <a:picLocks noChangeArrowheads="1" noChangeAspect="1"/>
                     </pic:cNvPicPr>
@@ -1404,7 +1404,7 @@
               <a:graphicData uri="http://schemas.openxmlformats.org/drawingml/2006/picture">
                 <pic:pic>
                   <pic:nvPicPr>
-                    <pic:cNvPr descr="/Users/jcmunoz/github_repositories/Proyecto-Provincias/03_Outputs/_Comparativo/figuras/fig_c07_icm.png" id="31" name="Picture"/>
+                    <pic:cNvPr descr="03_Outputs/_Comparativo/figuras/fig_c07_icm.png" id="31" name="Picture"/>
                     <pic:cNvPicPr>
                       <a:picLocks noChangeArrowheads="1" noChangeAspect="1"/>
                     </pic:cNvPicPr>
@@ -1476,7 +1476,7 @@
         <w:t xml:space="preserve"> </w:t>
       </w:r>
       <w:r>
-        <w:t xml:space="preserve">aparece. La ruralidad y la pobreza por NBI muestran una correlación de 0,41 entre las once provincias, pero al excluir al Área Metropolitana —que está en un extremo de las dos variables— la relación cae a 0,04, es decir, prácticamente nula. Entre las diez provincias rurales, ser más rural no predice tener más pobreza.</w:t>
+        <w:t xml:space="preserve">aparece. La ruralidad y la pobreza por NBI muestran una correlación de 0,47 entre las once provincias, pero al excluir al Área Metropolitana —que está en un extremo de las dos variables— la relación cae a 0,16, es decir, prácticamente nula. Entre las diez provincias rurales, ser más rural no predice tener más pobreza.</w:t>
       </w:r>
       <w:r>
         <w:t xml:space="preserve"> </w:t>
@@ -1488,7 +1488,7 @@
         <w:t xml:space="preserve"> </w:t>
       </w:r>
       <w:r>
-        <w:t xml:space="preserve">Las relaciones que sí son fuertes entre esas diez provincias apuntan en esa dirección. El Índice de Ciudades Modernas y la pobreza por NBI se mueven en direcciones opuestas con una correlación de -0,92; el acceso a internet fijo y la competitividad medida por el IMCA van juntos (0,92); la densidad poblacional y el déficit cualitativo de vivienda se oponen (-0,85); y la dependencia económica acompaña a la mortalidad infantil (0,78). El patrón que dibujan no es la ruralidad sino la</w:t>
+        <w:t xml:space="preserve">Las relaciones que sí son fuertes entre esas diez provincias apuntan en esa dirección. El Índice de Ciudades Modernas y la pobreza por NBI se mueven en direcciones opuestas con una correlación de -0,92; el acceso a internet fijo y la competitividad medida por el IMCA van juntos (0,94); la densidad poblacional y el déficit cualitativo de vivienda se oponen (-0,85); y la dependencia económica acompaña a la mortalidad infantil (0,80). El patrón que dibujan no es la ruralidad sino la</w:t>
       </w:r>
       <w:r>
         <w:t xml:space="preserve"> </w:t>
@@ -1534,7 +1534,7 @@
               <a:graphicData uri="http://schemas.openxmlformats.org/drawingml/2006/picture">
                 <pic:pic>
                   <pic:nvPicPr>
-                    <pic:cNvPr descr="/Users/jcmunoz/github_repositories/Proyecto-Provincias/03_Outputs/_Comparativo/figuras/fig_c09_ruralidad_nbi.png" id="35" name="Picture"/>
+                    <pic:cNvPr descr="03_Outputs/_Comparativo/figuras/fig_c09_ruralidad_nbi.png" id="35" name="Picture"/>
                     <pic:cNvPicPr>
                       <a:picLocks noChangeArrowheads="1" noChangeAspect="1"/>
                     </pic:cNvPicPr>
@@ -1589,7 +1589,7 @@
               <a:graphicData uri="http://schemas.openxmlformats.org/drawingml/2006/picture">
                 <pic:pic>
                   <pic:nvPicPr>
-                    <pic:cNvPr descr="/Users/jcmunoz/github_repositories/Proyecto-Provincias/03_Outputs/_Comparativo/figuras/fig_c10_icm_nbi.png" id="38" name="Picture"/>
+                    <pic:cNvPr descr="03_Outputs/_Comparativo/figuras/fig_c10_icm_nbi.png" id="38" name="Picture"/>
                     <pic:cNvPicPr>
                       <a:picLocks noChangeArrowheads="1" noChangeAspect="1"/>
                     </pic:cNvPicPr>
@@ -1668,7 +1668,7 @@
               <a:graphicData uri="http://schemas.openxmlformats.org/drawingml/2006/picture">
                 <pic:pic>
                   <pic:nvPicPr>
-                    <pic:cNvPr descr="/Users/jcmunoz/github_repositories/Proyecto-Provincias/03_Outputs/_Comparativo/figuras/fig_c08_homicidios.png" id="42" name="Picture"/>
+                    <pic:cNvPr descr="03_Outputs/_Comparativo/figuras/fig_c08_homicidios.png" id="42" name="Picture"/>
                     <pic:cNvPicPr>
                       <a:picLocks noChangeArrowheads="1" noChangeAspect="1"/>
                     </pic:cNvPicPr>
@@ -1760,7 +1760,7 @@
               <a:graphicData uri="http://schemas.openxmlformats.org/drawingml/2006/picture">
                 <pic:pic>
                   <pic:nvPicPr>
-                    <pic:cNvPr descr="/Users/jcmunoz/github_repositories/Proyecto-Provincias/03_Outputs/_Comparativo/figuras/fig_c11_perfil_posiciones.png" id="46" name="Picture"/>
+                    <pic:cNvPr descr="03_Outputs/_Comparativo/figuras/fig_c11_perfil_posiciones.png" id="46" name="Picture"/>
                     <pic:cNvPicPr>
                       <a:picLocks noChangeArrowheads="1" noChangeAspect="1"/>
                     </pic:cNvPicPr>
@@ -6294,7 +6294,7 @@
       <w:kern w:val="0"/>
       <w:sz w:val="21"/>
       <w:szCs w:val="20"/>
-      <w:lang w:eastAsia="es-MX" w:val="es"/>
+      <w:lang w:eastAsia="es-MX" w:val="es-ES_tradnl"/>
       <w14:ligatures w14:val="none"/>
     </w:rPr>
   </w:style>
@@ -6613,7 +6613,7 @@
     <w:uiPriority w:val="99"/>
     <w:rsid w:val="004863D8"/>
     <w:rPr>
-      <w:lang w:val="es"/>
+      <w:lang w:val="es-CO"/>
     </w:rPr>
   </w:style>
   <w:style w:customStyle="1" w:styleId="PiedepginaCar1" w:type="character">
@@ -6621,7 +6621,7 @@
     <w:uiPriority w:val="99"/>
     <w:rsid w:val="004863D8"/>
     <w:rPr>
-      <w:lang w:val="es"/>
+      <w:lang w:val="es-CO"/>
     </w:rPr>
   </w:style>
   <w:style w:styleId="Subtitle" w:type="paragraph">
@@ -6696,7 +6696,7 @@
       <w:kern w:val="0"/>
       <w:sz w:val="21"/>
       <w:szCs w:val="21"/>
-      <w:lang w:eastAsia="zh-CN" w:val="es"/>
+      <w:lang w:eastAsia="zh-CN" w:val="en-US"/>
       <w14:ligatures w14:val="none"/>
     </w:rPr>
   </w:style>
@@ -6885,7 +6885,7 @@
       <w:kern w:val="0"/>
       <w:sz w:val="24"/>
       <w:szCs w:val="24"/>
-      <w:lang w:val="es"/>
+      <w:lang w:val="en-US"/>
       <w14:ligatures w14:val="none"/>
     </w:rPr>
   </w:style>
@@ -6897,7 +6897,7 @@
       <w:kern w:val="0"/>
       <w:sz w:val="24"/>
       <w:szCs w:val="24"/>
-      <w:lang w:val="es"/>
+      <w:lang w:val="en-US"/>
       <w14:ligatures w14:val="none"/>
     </w:rPr>
   </w:style>
@@ -7019,7 +7019,7 @@
       <w:kern w:val="0"/>
       <w:sz w:val="24"/>
       <w:szCs w:val="24"/>
-      <w:lang w:val="es"/>
+      <w:lang w:val="en-US"/>
       <w14:ligatures w14:val="none"/>
     </w:rPr>
   </w:style>

</xml_diff>